<commit_message>
Final update with photos and code
</commit_message>
<xml_diff>
--- a/sxediagramma.docx
+++ b/sxediagramma.docx
@@ -126,24 +126,76 @@
           <w:lang w:val="en-US"/>
         </w:rPr>
       </w:pPr>
-      <w:r>
-        <w:rPr>
-          <w:lang w:val="en-US"/>
-        </w:rPr>
-        <w:t xml:space="preserve">Ellhnika </w:t>
-      </w:r>
-    </w:p>
-    <w:p>
-      <w:pPr>
-        <w:rPr>
-          <w:lang w:val="en-US"/>
-        </w:rPr>
-      </w:pPr>
-      <w:r>
-        <w:rPr>
-          <w:lang w:val="en-US"/>
-        </w:rPr>
-        <w:t xml:space="preserve">Xromata : xaroymena- aspro – animations – mple </w:t>
+      <w:proofErr w:type="spellStart"/>
+      <w:r>
+        <w:rPr>
+          <w:lang w:val="en-US"/>
+        </w:rPr>
+        <w:t>Ellhnika</w:t>
+      </w:r>
+      <w:proofErr w:type="spellEnd"/>
+      <w:r>
+        <w:rPr>
+          <w:lang w:val="en-US"/>
+        </w:rPr>
+        <w:t xml:space="preserve"> </w:t>
+      </w:r>
+    </w:p>
+    <w:p>
+      <w:pPr>
+        <w:rPr>
+          <w:lang w:val="en-US"/>
+        </w:rPr>
+      </w:pPr>
+      <w:proofErr w:type="spellStart"/>
+      <w:proofErr w:type="gramStart"/>
+      <w:r>
+        <w:rPr>
+          <w:lang w:val="en-US"/>
+        </w:rPr>
+        <w:t>Xromata</w:t>
+      </w:r>
+      <w:proofErr w:type="spellEnd"/>
+      <w:r>
+        <w:rPr>
+          <w:lang w:val="en-US"/>
+        </w:rPr>
+        <w:t xml:space="preserve"> :</w:t>
+      </w:r>
+      <w:proofErr w:type="gramEnd"/>
+      <w:r>
+        <w:rPr>
+          <w:lang w:val="en-US"/>
+        </w:rPr>
+        <w:t xml:space="preserve"> </w:t>
+      </w:r>
+      <w:proofErr w:type="spellStart"/>
+      <w:r>
+        <w:rPr>
+          <w:lang w:val="en-US"/>
+        </w:rPr>
+        <w:t>xaroymena</w:t>
+      </w:r>
+      <w:proofErr w:type="spellEnd"/>
+      <w:r>
+        <w:rPr>
+          <w:lang w:val="en-US"/>
+        </w:rPr>
+        <w:t xml:space="preserve">- aspro – animations – </w:t>
+      </w:r>
+      <w:proofErr w:type="spellStart"/>
+      <w:r>
+        <w:rPr>
+          <w:lang w:val="en-US"/>
+        </w:rPr>
+        <w:t>mple</w:t>
+      </w:r>
+      <w:proofErr w:type="spellEnd"/>
+      <w:r>
+        <w:rPr>
+          <w:lang w:val="en-US"/>
+        </w:rPr>
+        <w:t xml:space="preserve"> </w:t>
       </w:r>
       <w:r>
         <w:rPr>
@@ -158,70 +210,164 @@
           <w:lang w:val="en-US"/>
         </w:rPr>
       </w:pPr>
-      <w:r>
-        <w:rPr>
-          <w:lang w:val="en-US"/>
-        </w:rPr>
-        <w:t>Selides : ARXIKI – FVTOGRAFIES- PROINTA MAS – EPIKOINONIA</w:t>
-      </w:r>
-    </w:p>
-    <w:p>
-      <w:pPr>
-        <w:rPr>
-          <w:lang w:val="en-US"/>
-        </w:rPr>
-      </w:pPr>
+      <w:proofErr w:type="spellStart"/>
+      <w:proofErr w:type="gramStart"/>
+      <w:r>
+        <w:rPr>
+          <w:lang w:val="en-US"/>
+        </w:rPr>
+        <w:t>Selides</w:t>
+      </w:r>
+      <w:proofErr w:type="spellEnd"/>
+      <w:r>
+        <w:rPr>
+          <w:lang w:val="en-US"/>
+        </w:rPr>
+        <w:t xml:space="preserve"> :</w:t>
+      </w:r>
+      <w:proofErr w:type="gramEnd"/>
+      <w:r>
+        <w:rPr>
+          <w:lang w:val="en-US"/>
+        </w:rPr>
+        <w:t xml:space="preserve"> ARXIKI – FVTOGRAFIES- PROINTA MAS – EPIKOINONIA</w:t>
+      </w:r>
+    </w:p>
+    <w:p>
+      <w:pPr>
+        <w:rPr>
+          <w:lang w:val="en-US"/>
+        </w:rPr>
+      </w:pPr>
+      <w:proofErr w:type="gramStart"/>
       <w:r>
         <w:rPr>
           <w:lang w:val="en-US"/>
         </w:rPr>
         <w:t>Email:christinachartzanioti26@gmail.com</w:t>
       </w:r>
-    </w:p>
-    <w:p>
-      <w:pPr>
-        <w:rPr>
-          <w:lang w:val="en-US"/>
-        </w:rPr>
-      </w:pPr>
-      <w:r>
-        <w:rPr>
-          <w:lang w:val="en-US"/>
-        </w:rPr>
-        <w:t>Thl:+30 6982347557 + viber+ whatsup</w:t>
-      </w:r>
-    </w:p>
-    <w:p>
-      <w:pPr>
-        <w:rPr>
-          <w:lang w:val="en-US"/>
-        </w:rPr>
-      </w:pPr>
-      <w:r>
-        <w:rPr>
-          <w:lang w:val="en-US"/>
-        </w:rPr>
-        <w:t xml:space="preserve">Keimana :  XRISTINA – GEVRGIA KALOSHRTHATE STO CHRISTINAS </w:t>
-      </w:r>
-    </w:p>
-    <w:p>
-      <w:pPr>
-        <w:rPr>
-          <w:lang w:val="en-US"/>
-        </w:rPr>
-      </w:pPr>
-      <w:r>
-        <w:rPr>
-          <w:lang w:val="en-US"/>
-        </w:rPr>
-        <w:t>(ANTRIKA – GYNAIKEIA – ROYXA -KOSMHMATA ACCSOYAR TSANTES)</w:t>
-      </w:r>
-      <w:r>
-        <w:rPr>
-          <w:lang w:val="en-US"/>
-        </w:rPr>
-        <w:t>(EPITEREPETE DOKIMI )</w:t>
-      </w:r>
+      <w:proofErr w:type="gramEnd"/>
+    </w:p>
+    <w:p>
+      <w:pPr>
+        <w:rPr>
+          <w:lang w:val="en-US"/>
+        </w:rPr>
+      </w:pPr>
+      <w:proofErr w:type="spellStart"/>
+      <w:proofErr w:type="gramStart"/>
+      <w:r>
+        <w:rPr>
+          <w:lang w:val="en-US"/>
+        </w:rPr>
+        <w:t>Thl</w:t>
+      </w:r>
+      <w:proofErr w:type="spellEnd"/>
+      <w:r>
+        <w:rPr>
+          <w:lang w:val="en-US"/>
+        </w:rPr>
+        <w:t>:+</w:t>
+      </w:r>
+      <w:proofErr w:type="gramEnd"/>
+      <w:r>
+        <w:rPr>
+          <w:lang w:val="en-US"/>
+        </w:rPr>
+        <w:t xml:space="preserve">30 6982347557 + </w:t>
+      </w:r>
+      <w:proofErr w:type="spellStart"/>
+      <w:r>
+        <w:rPr>
+          <w:lang w:val="en-US"/>
+        </w:rPr>
+        <w:t>viber</w:t>
+      </w:r>
+      <w:proofErr w:type="spellEnd"/>
+      <w:r>
+        <w:rPr>
+          <w:lang w:val="en-US"/>
+        </w:rPr>
+        <w:t xml:space="preserve">+ </w:t>
+      </w:r>
+      <w:proofErr w:type="spellStart"/>
+      <w:r>
+        <w:rPr>
+          <w:lang w:val="en-US"/>
+        </w:rPr>
+        <w:t>whatsup</w:t>
+      </w:r>
+      <w:proofErr w:type="spellEnd"/>
+    </w:p>
+    <w:p>
+      <w:pPr>
+        <w:rPr>
+          <w:lang w:val="en-US"/>
+        </w:rPr>
+      </w:pPr>
+      <w:proofErr w:type="spellStart"/>
+      <w:proofErr w:type="gramStart"/>
+      <w:r>
+        <w:rPr>
+          <w:lang w:val="en-US"/>
+        </w:rPr>
+        <w:t>Keimana</w:t>
+      </w:r>
+      <w:proofErr w:type="spellEnd"/>
+      <w:r>
+        <w:rPr>
+          <w:lang w:val="en-US"/>
+        </w:rPr>
+        <w:t xml:space="preserve"> :</w:t>
+      </w:r>
+      <w:proofErr w:type="gramEnd"/>
+      <w:r>
+        <w:rPr>
+          <w:lang w:val="en-US"/>
+        </w:rPr>
+        <w:t xml:space="preserve">  XRISTINA – GEVRGIA KALOSHRTHATE STO CHRISTINAS </w:t>
+      </w:r>
+    </w:p>
+    <w:p>
+      <w:pPr>
+        <w:rPr>
+          <w:lang w:val="en-US"/>
+        </w:rPr>
+      </w:pPr>
+      <w:r>
+        <w:rPr>
+          <w:lang w:val="en-US"/>
+        </w:rPr>
+        <w:t xml:space="preserve">(ANTRIKA – GYNAIKEIA – ROYXA -KOSMHMATA ACCSOYAR </w:t>
+      </w:r>
+      <w:proofErr w:type="gramStart"/>
+      <w:r>
+        <w:rPr>
+          <w:lang w:val="en-US"/>
+        </w:rPr>
+        <w:t>TSANTES)</w:t>
+      </w:r>
+      <w:r>
+        <w:rPr>
+          <w:lang w:val="en-US"/>
+        </w:rPr>
+        <w:t>(</w:t>
+      </w:r>
+      <w:proofErr w:type="gramEnd"/>
+      <w:r>
+        <w:rPr>
+          <w:lang w:val="en-US"/>
+        </w:rPr>
+        <w:t xml:space="preserve">EPITEREPETE </w:t>
+      </w:r>
+      <w:proofErr w:type="gramStart"/>
+      <w:r>
+        <w:rPr>
+          <w:lang w:val="en-US"/>
+        </w:rPr>
+        <w:t>DOKIMI )</w:t>
+      </w:r>
+      <w:proofErr w:type="gramEnd"/>
     </w:p>
     <w:p>
       <w:pPr>
@@ -239,19 +385,47 @@
         <w:rPr>
           <w:lang w:val="en-US"/>
         </w:rPr>
-        <w:t xml:space="preserve"> POLLA XEIROPOIHTA PROINTA </w:t>
-      </w:r>
-      <w:r>
-        <w:rPr>
-          <w:lang w:val="en-US"/>
-        </w:rPr>
-        <w:t xml:space="preserve"> KAI GENIA MPOREIS APO ENA DOYRAKI TON 5 EYRO  </w:t>
-      </w:r>
-      <w:r>
-        <w:rPr>
-          <w:lang w:val="en-US"/>
-        </w:rPr>
-        <w:t xml:space="preserve">FILIKO OIKOGENEIAKO ZESTO PERIVALLON EKSHPHRETIKO TO XAMOGELO KAI H OMORFH DISATHESH EINAI PANTA STHN DIATHESH SAS MONTERNO EPIKAIRO </w:t>
+        <w:t xml:space="preserve"> POLLA XEIROPOIHTA </w:t>
+      </w:r>
+      <w:proofErr w:type="gramStart"/>
+      <w:r>
+        <w:rPr>
+          <w:lang w:val="en-US"/>
+        </w:rPr>
+        <w:t xml:space="preserve">PROINTA </w:t>
+      </w:r>
+      <w:r>
+        <w:rPr>
+          <w:lang w:val="en-US"/>
+        </w:rPr>
+        <w:t xml:space="preserve"> KAI</w:t>
+      </w:r>
+      <w:proofErr w:type="gramEnd"/>
+      <w:r>
+        <w:rPr>
+          <w:lang w:val="en-US"/>
+        </w:rPr>
+        <w:t xml:space="preserve"> GENIA MPOREIS APO ENA DOYRAKI TON 5 </w:t>
+      </w:r>
+      <w:proofErr w:type="gramStart"/>
+      <w:r>
+        <w:rPr>
+          <w:lang w:val="en-US"/>
+        </w:rPr>
+        <w:t xml:space="preserve">EYRO  </w:t>
+      </w:r>
+      <w:r>
+        <w:rPr>
+          <w:lang w:val="en-US"/>
+        </w:rPr>
+        <w:t>FILIKO</w:t>
+      </w:r>
+      <w:proofErr w:type="gramEnd"/>
+      <w:r>
+        <w:rPr>
+          <w:lang w:val="en-US"/>
+        </w:rPr>
+        <w:t xml:space="preserve"> OIKOGENEIAKO ZESTO PERIVALLON EKSHPHRETIKO TO XAMOGELO KAI H OMORFH DISATHESH EINAI PANTA STHN DIATHESH SAS MONTERNO EPIKAIRO </w:t>
       </w:r>
     </w:p>
     <w:p>
@@ -293,6 +467,166 @@
           <w:lang w:val="en-US"/>
         </w:rPr>
       </w:pPr>
+    </w:p>
+    <w:p>
+      <w:pPr>
+        <w:rPr>
+          <w:lang w:val="en-US"/>
+        </w:rPr>
+      </w:pPr>
+    </w:p>
+    <w:p>
+      <w:pPr>
+        <w:rPr>
+          <w:lang w:val="en-US"/>
+        </w:rPr>
+      </w:pPr>
+    </w:p>
+    <w:p>
+      <w:pPr>
+        <w:rPr>
+          <w:lang w:val="en-US"/>
+        </w:rPr>
+      </w:pPr>
+    </w:p>
+    <w:p>
+      <w:pPr>
+        <w:rPr>
+          <w:lang w:val="en-US"/>
+        </w:rPr>
+      </w:pPr>
+    </w:p>
+    <w:p>
+      <w:pPr>
+        <w:rPr>
+          <w:lang w:val="en-US"/>
+        </w:rPr>
+      </w:pPr>
+    </w:p>
+    <w:p>
+      <w:pPr>
+        <w:rPr>
+          <w:lang w:val="en-US"/>
+        </w:rPr>
+      </w:pPr>
+    </w:p>
+    <w:p>
+      <w:pPr>
+        <w:rPr>
+          <w:lang w:val="en-US"/>
+        </w:rPr>
+      </w:pPr>
+    </w:p>
+    <w:p>
+      <w:pPr>
+        <w:rPr>
+          <w:lang w:val="en-US"/>
+        </w:rPr>
+      </w:pPr>
+    </w:p>
+    <w:p>
+      <w:pPr>
+        <w:rPr>
+          <w:lang w:val="en-US"/>
+        </w:rPr>
+      </w:pPr>
+    </w:p>
+    <w:p>
+      <w:pPr>
+        <w:jc w:val="center"/>
+        <w:rPr>
+          <w:sz w:val="28"/>
+          <w:szCs w:val="28"/>
+          <w:lang w:val="en-US"/>
+        </w:rPr>
+      </w:pPr>
+      <w:r>
+        <w:rPr>
+          <w:noProof/>
+          <w:sz w:val="28"/>
+          <w:szCs w:val="28"/>
+        </w:rPr>
+        <w:lastRenderedPageBreak/>
+        <w:drawing>
+          <wp:inline distT="0" distB="0" distL="0" distR="0" wp14:anchorId="03D62DD8" wp14:editId="4AA95F8F">
+            <wp:extent cx="3162300" cy="3162300"/>
+            <wp:effectExtent l="0" t="0" r="0" b="0"/>
+            <wp:docPr id="1609847446" name="Εικόνα 1"/>
+            <wp:cNvGraphicFramePr>
+              <a:graphicFrameLocks xmlns:a="http://schemas.openxmlformats.org/drawingml/2006/main" noChangeAspect="1"/>
+            </wp:cNvGraphicFramePr>
+            <a:graphic xmlns:a="http://schemas.openxmlformats.org/drawingml/2006/main">
+              <a:graphicData uri="http://schemas.openxmlformats.org/drawingml/2006/picture">
+                <pic:pic xmlns:pic="http://schemas.openxmlformats.org/drawingml/2006/picture">
+                  <pic:nvPicPr>
+                    <pic:cNvPr id="1609847446" name="Εικόνα 1609847446"/>
+                    <pic:cNvPicPr/>
+                  </pic:nvPicPr>
+                  <pic:blipFill>
+                    <a:blip r:embed="rId5">
+                      <a:extLst>
+                        <a:ext uri="{28A0092B-C50C-407E-A947-70E740481C1C}">
+                          <a14:useLocalDpi xmlns:a14="http://schemas.microsoft.com/office/drawing/2010/main" val="0"/>
+                        </a:ext>
+                      </a:extLst>
+                    </a:blip>
+                    <a:stretch>
+                      <a:fillRect/>
+                    </a:stretch>
+                  </pic:blipFill>
+                  <pic:spPr>
+                    <a:xfrm>
+                      <a:off x="0" y="0"/>
+                      <a:ext cx="3162300" cy="3162300"/>
+                    </a:xfrm>
+                    <a:prstGeom prst="rect">
+                      <a:avLst/>
+                    </a:prstGeom>
+                  </pic:spPr>
+                </pic:pic>
+              </a:graphicData>
+            </a:graphic>
+          </wp:inline>
+        </w:drawing>
+      </w:r>
+      <w:r>
+        <w:rPr>
+          <w:sz w:val="28"/>
+          <w:szCs w:val="28"/>
+          <w:lang w:val="en-US"/>
+        </w:rPr>
+        <w:t xml:space="preserve"> </w:t>
+      </w:r>
+    </w:p>
+    <w:p>
+      <w:pPr>
+        <w:jc w:val="center"/>
+        <w:rPr>
+          <w:b/>
+          <w:bCs/>
+          <w:i/>
+          <w:iCs/>
+          <w:color w:val="215868" w:themeColor="accent5" w:themeShade="80"/>
+          <w:sz w:val="44"/>
+          <w:szCs w:val="44"/>
+          <w:u w:val="single"/>
+          <w:lang w:val="en-US"/>
+        </w:rPr>
+      </w:pPr>
+      <w:r>
+        <w:rPr>
+          <w:b/>
+          <w:bCs/>
+          <w:i/>
+          <w:iCs/>
+          <w:color w:val="215868" w:themeColor="accent5" w:themeShade="80"/>
+          <w:sz w:val="44"/>
+          <w:szCs w:val="44"/>
+          <w:u w:val="single"/>
+          <w:lang w:val="en-US"/>
+        </w:rPr>
+        <w:t>Scan to Discover Our Story!</w:t>
+      </w:r>
     </w:p>
     <w:p>
       <w:pPr>

</xml_diff>